<commit_message>
file: gido log sprint 4
</commit_message>
<xml_diff>
--- a/Templates/Log/Sprint 2 - Log Gido Verhoef.docx
+++ b/Templates/Log/Sprint 2 - Log Gido Verhoef.docx
@@ -957,15 +957,7 @@
           <w:b/>
           <w:bCs/>
         </w:rPr>
-        <w:t xml:space="preserve"> </w:t>
-      </w:r>
-      <w:proofErr w:type="spellStart"/>
-      <w:r>
-        <w:rPr>
-          <w:b/>
-          <w:bCs/>
-        </w:rPr>
-        <w:t>StandUp</w:t>
+        <w:t xml:space="preserve"> StandUp</w:t>
       </w:r>
       <w:r>
         <w:rPr>
@@ -974,7 +966,6 @@
         </w:rPr>
         <w:t>s</w:t>
       </w:r>
-      <w:proofErr w:type="spellEnd"/>
       <w:r>
         <w:rPr>
           <w:b/>
@@ -1448,23 +1439,7 @@
           <w:i/>
           <w:iCs/>
         </w:rPr>
-        <w:t xml:space="preserve">[Welke onderdelen/taken wil je volgende werkdag weer oppakken/ ook te gebruiken voor je volgende Daily </w:t>
-      </w:r>
-      <w:proofErr w:type="spellStart"/>
-      <w:r>
-        <w:rPr>
-          <w:i/>
-          <w:iCs/>
-        </w:rPr>
-        <w:t>standUp</w:t>
-      </w:r>
-      <w:proofErr w:type="spellEnd"/>
-      <w:r>
-        <w:rPr>
-          <w:i/>
-          <w:iCs/>
-        </w:rPr>
-        <w:t>?]</w:t>
+        <w:t>[Welke onderdelen/taken wil je volgende werkdag weer oppakken/ ook te gebruiken voor je volgende Daily standUp?]</w:t>
       </w:r>
     </w:p>
     <w:p>
@@ -1545,15 +1520,7 @@
           <w:b/>
           <w:bCs/>
         </w:rPr>
-        <w:t xml:space="preserve"> </w:t>
-      </w:r>
-      <w:proofErr w:type="spellStart"/>
-      <w:r>
-        <w:rPr>
-          <w:b/>
-          <w:bCs/>
-        </w:rPr>
-        <w:t>StandUp</w:t>
+        <w:t xml:space="preserve"> StandUp</w:t>
       </w:r>
       <w:r>
         <w:rPr>
@@ -1562,7 +1529,6 @@
         </w:rPr>
         <w:t>s</w:t>
       </w:r>
-      <w:proofErr w:type="spellEnd"/>
       <w:r>
         <w:rPr>
           <w:b/>
@@ -1950,15 +1916,7 @@
         <w:br/>
       </w:r>
       <w:r>
-        <w:t xml:space="preserve">in sprint 1 hebben we vooral gebrainstormde over concepten, we hebben sjablonen ingevuld en </w:t>
-      </w:r>
-      <w:proofErr w:type="spellStart"/>
-      <w:r>
-        <w:t>slowcharts</w:t>
-      </w:r>
-      <w:proofErr w:type="spellEnd"/>
-      <w:r>
-        <w:t xml:space="preserve">, diagrammen en heb ik concept art gemaakt. Ook hebben ik ons concept gepresenteerd  </w:t>
+        <w:t xml:space="preserve">in sprint 1 hebben we vooral gebrainstormde over concepten, we hebben sjablonen ingevuld en slowcharts, diagrammen en heb ik concept art gemaakt. Ook hebben ik ons concept gepresenteerd  </w:t>
       </w:r>
     </w:p>
     <w:p>
@@ -2026,71 +1984,7 @@
           <w:i/>
           <w:iCs/>
         </w:rPr>
-        <w:t xml:space="preserve">dat ik </w:t>
-      </w:r>
-      <w:proofErr w:type="spellStart"/>
-      <w:r>
-        <w:rPr>
-          <w:i/>
-          <w:iCs/>
-        </w:rPr>
-        <w:t>optijd</w:t>
-      </w:r>
-      <w:proofErr w:type="spellEnd"/>
-      <w:r>
-        <w:rPr>
-          <w:i/>
-          <w:iCs/>
-        </w:rPr>
-        <w:t xml:space="preserve"> moet beginnen met de presentaties maken, zodat het nog </w:t>
-      </w:r>
-      <w:proofErr w:type="spellStart"/>
-      <w:r>
-        <w:rPr>
-          <w:i/>
-          <w:iCs/>
-        </w:rPr>
-        <w:t>dubble</w:t>
-      </w:r>
-      <w:proofErr w:type="spellEnd"/>
-      <w:r>
-        <w:rPr>
-          <w:i/>
-          <w:iCs/>
-        </w:rPr>
-        <w:t xml:space="preserve"> </w:t>
-      </w:r>
-      <w:proofErr w:type="spellStart"/>
-      <w:r>
-        <w:rPr>
-          <w:i/>
-          <w:iCs/>
-        </w:rPr>
-        <w:t>gechecked</w:t>
-      </w:r>
-      <w:proofErr w:type="spellEnd"/>
-      <w:r>
-        <w:rPr>
-          <w:i/>
-          <w:iCs/>
-        </w:rPr>
-        <w:t xml:space="preserve"> kan worden op </w:t>
-      </w:r>
-      <w:proofErr w:type="spellStart"/>
-      <w:r>
-        <w:rPr>
-          <w:i/>
-          <w:iCs/>
-        </w:rPr>
-        <w:t>spellings</w:t>
-      </w:r>
-      <w:proofErr w:type="spellEnd"/>
-      <w:r>
-        <w:rPr>
-          <w:i/>
-          <w:iCs/>
-        </w:rPr>
-        <w:t xml:space="preserve"> fouten en foute informatie</w:t>
+        <w:t>dat ik optijd moet beginnen met de presentaties maken, zodat het nog dubble gechecked kan worden op spellings fouten en foute informatie</w:t>
       </w:r>
       <w:r>
         <w:rPr>
@@ -2188,23 +2082,7 @@
           <w:i/>
           <w:iCs/>
         </w:rPr>
-        <w:t xml:space="preserve">ik heb geen feedback voor de </w:t>
-      </w:r>
-      <w:proofErr w:type="spellStart"/>
-      <w:r>
-        <w:rPr>
-          <w:i/>
-          <w:iCs/>
-        </w:rPr>
-        <w:t>groeps</w:t>
-      </w:r>
-      <w:proofErr w:type="spellEnd"/>
-      <w:r>
-        <w:rPr>
-          <w:i/>
-          <w:iCs/>
-        </w:rPr>
-        <w:t xml:space="preserve"> leden</w:t>
+        <w:t>ik heb geen feedback voor de groeps leden</w:t>
       </w:r>
       <w:r>
         <w:rPr>
@@ -2395,15 +2273,7 @@
           <w:b/>
           <w:bCs/>
         </w:rPr>
-        <w:t xml:space="preserve"> </w:t>
-      </w:r>
-      <w:proofErr w:type="spellStart"/>
-      <w:r>
-        <w:rPr>
-          <w:b/>
-          <w:bCs/>
-        </w:rPr>
-        <w:t>StandUp</w:t>
+        <w:t xml:space="preserve"> StandUp</w:t>
       </w:r>
       <w:r>
         <w:rPr>
@@ -2412,7 +2282,6 @@
         </w:rPr>
         <w:t>s</w:t>
       </w:r>
-      <w:proofErr w:type="spellEnd"/>
       <w:r>
         <w:rPr>
           <w:b/>
@@ -3050,39 +2919,7 @@
           <w:i/>
           <w:iCs/>
         </w:rPr>
-        <w:t xml:space="preserve">we zijn deze sprint begonnen met </w:t>
-      </w:r>
-      <w:proofErr w:type="spellStart"/>
-      <w:r>
-        <w:rPr>
-          <w:i/>
-          <w:iCs/>
-        </w:rPr>
-        <w:t>programeren</w:t>
-      </w:r>
-      <w:proofErr w:type="spellEnd"/>
-      <w:r>
-        <w:rPr>
-          <w:i/>
-          <w:iCs/>
-        </w:rPr>
-        <w:t xml:space="preserve"> binnen </w:t>
-      </w:r>
-      <w:proofErr w:type="spellStart"/>
-      <w:r>
-        <w:rPr>
-          <w:i/>
-          <w:iCs/>
-        </w:rPr>
-        <w:t>unity</w:t>
-      </w:r>
-      <w:proofErr w:type="spellEnd"/>
-      <w:r>
-        <w:rPr>
-          <w:i/>
-          <w:iCs/>
-        </w:rPr>
-        <w:t xml:space="preserve">, scenes gemaakt, scripts gemaakt. </w:t>
+        <w:t xml:space="preserve">we zijn deze sprint begonnen met programeren binnen unity, scenes gemaakt, scripts gemaakt. </w:t>
       </w:r>
       <w:r>
         <w:rPr>
@@ -3118,23 +2955,7 @@
           <w:i/>
           <w:iCs/>
         </w:rPr>
-        <w:t xml:space="preserve">De enige uitdaging die ik momenteel zie ik het </w:t>
-      </w:r>
-      <w:proofErr w:type="spellStart"/>
-      <w:r>
-        <w:rPr>
-          <w:i/>
-          <w:iCs/>
-        </w:rPr>
-        <w:t>inspawnen</w:t>
-      </w:r>
-      <w:proofErr w:type="spellEnd"/>
-      <w:r>
-        <w:rPr>
-          <w:i/>
-          <w:iCs/>
-        </w:rPr>
-        <w:t xml:space="preserve"> van obstakels op de baan, een collider gebruiken is momenteel niet de oplossing want dan botst de speler met de map zelf</w:t>
+        <w:t>De enige uitdaging die ik momenteel zie ik het inspawnen van obstakels op de baan, een collider gebruiken is momenteel niet de oplossing want dan botst de speler met de map zelf</w:t>
       </w:r>
       <w:r>
         <w:rPr>
@@ -3178,23 +2999,7 @@
           <w:i/>
           <w:iCs/>
         </w:rPr>
-        <w:t xml:space="preserve">, voordat dat ik het meer doel </w:t>
-      </w:r>
-      <w:proofErr w:type="spellStart"/>
-      <w:r>
-        <w:rPr>
-          <w:i/>
-          <w:iCs/>
-        </w:rPr>
-        <w:t>gefocussed</w:t>
-      </w:r>
-      <w:proofErr w:type="spellEnd"/>
-      <w:r>
-        <w:rPr>
-          <w:i/>
-          <w:iCs/>
-        </w:rPr>
-        <w:t xml:space="preserve"> moet doen</w:t>
+        <w:t>, voordat dat ik het meer doel gefocussed moet doen</w:t>
       </w:r>
       <w:r>
         <w:rPr>
@@ -3440,33 +3245,8 @@
           <w:i/>
           <w:iCs/>
         </w:rPr>
-        <w:t xml:space="preserve">ik ga obstakel </w:t>
-      </w:r>
-      <w:proofErr w:type="spellStart"/>
-      <w:r>
-        <w:rPr>
-          <w:i/>
-          <w:iCs/>
-        </w:rPr>
-        <w:t>inspawnen</w:t>
-      </w:r>
-      <w:proofErr w:type="spellEnd"/>
-      <w:r>
-        <w:rPr>
-          <w:i/>
-          <w:iCs/>
-        </w:rPr>
-        <w:t xml:space="preserve"> afmaken. Ga een list toevoegen dat een random obstakels pakt en zorgen dat hij op de baan </w:t>
-      </w:r>
-      <w:proofErr w:type="spellStart"/>
-      <w:r>
-        <w:rPr>
-          <w:i/>
-          <w:iCs/>
-        </w:rPr>
-        <w:t>spawnt</w:t>
-      </w:r>
-      <w:proofErr w:type="spellEnd"/>
+        <w:t>ik ga obstakel inspawnen afmaken. Ga een list toevoegen dat een random obstakels pakt en zorgen dat hij op de baan spawnt</w:t>
+      </w:r>
     </w:p>
     <w:p>
       <w:pPr>
@@ -3543,15 +3323,7 @@
           <w:b/>
           <w:bCs/>
         </w:rPr>
-        <w:t xml:space="preserve"> </w:t>
-      </w:r>
-      <w:proofErr w:type="spellStart"/>
-      <w:r>
-        <w:rPr>
-          <w:b/>
-          <w:bCs/>
-        </w:rPr>
-        <w:t>StandUp</w:t>
+        <w:t xml:space="preserve"> StandUp</w:t>
       </w:r>
       <w:r>
         <w:rPr>
@@ -3560,7 +3332,6 @@
         </w:rPr>
         <w:t>s</w:t>
       </w:r>
-      <w:proofErr w:type="spellEnd"/>
       <w:r>
         <w:rPr>
           <w:b/>
@@ -3579,6 +3350,7 @@
         <w:rPr>
           <w:i/>
           <w:iCs/>
+          <w:noProof/>
         </w:rPr>
         <w:drawing>
           <wp:inline distT="0" distB="0" distL="0" distR="0" wp14:anchorId="4E96FE97" wp14:editId="75255A72">
@@ -3626,6 +3398,7 @@
         <w:rPr>
           <w:i/>
           <w:iCs/>
+          <w:noProof/>
         </w:rPr>
         <w:drawing>
           <wp:inline distT="0" distB="0" distL="0" distR="0" wp14:anchorId="7A35C516" wp14:editId="7A4FF72B">
@@ -3673,6 +3446,7 @@
         <w:rPr>
           <w:i/>
           <w:iCs/>
+          <w:noProof/>
         </w:rPr>
         <w:lastRenderedPageBreak/>
         <w:drawing>
@@ -3721,6 +3495,7 @@
         <w:rPr>
           <w:i/>
           <w:iCs/>
+          <w:noProof/>
         </w:rPr>
         <w:drawing>
           <wp:inline distT="0" distB="0" distL="0" distR="0" wp14:anchorId="1A8C17F3" wp14:editId="5763691A">
@@ -3768,6 +3543,7 @@
         <w:rPr>
           <w:i/>
           <w:iCs/>
+          <w:noProof/>
         </w:rPr>
         <w:lastRenderedPageBreak/>
         <w:drawing>
@@ -3816,6 +3592,7 @@
         <w:rPr>
           <w:i/>
           <w:iCs/>
+          <w:noProof/>
         </w:rPr>
         <w:drawing>
           <wp:inline distT="0" distB="0" distL="0" distR="0" wp14:anchorId="04C1C78A" wp14:editId="2F5612DF">
@@ -3863,6 +3640,7 @@
         <w:rPr>
           <w:i/>
           <w:iCs/>
+          <w:noProof/>
         </w:rPr>
         <w:lastRenderedPageBreak/>
         <w:drawing>
@@ -3911,6 +3689,7 @@
         <w:rPr>
           <w:i/>
           <w:iCs/>
+          <w:noProof/>
         </w:rPr>
         <w:drawing>
           <wp:inline distT="0" distB="0" distL="0" distR="0" wp14:anchorId="6BA0455E" wp14:editId="7E9221A7">
@@ -3958,6 +3737,7 @@
         <w:rPr>
           <w:i/>
           <w:iCs/>
+          <w:noProof/>
         </w:rPr>
         <w:lastRenderedPageBreak/>
         <w:drawing>
@@ -4006,6 +3786,7 @@
         <w:rPr>
           <w:i/>
           <w:iCs/>
+          <w:noProof/>
         </w:rPr>
         <w:drawing>
           <wp:inline distT="0" distB="0" distL="0" distR="0" wp14:anchorId="75CF5EDF" wp14:editId="1533A8F6">
@@ -4068,15 +3849,7 @@
     </w:p>
     <w:p>
       <w:r>
-        <w:t xml:space="preserve">In sprint 3 hebben we verder gewerkt aan de game. Ik heb zelf de user story rondom object pooling afgerond. We werkten als team aan de game, waarbij mijn bijdrage vooral lag bij het optimaliseren van de prestaties met behulp van object pooling. Sommige onderdelen zijn nog niet af, zoals het toepassen van </w:t>
-      </w:r>
-      <w:proofErr w:type="spellStart"/>
-      <w:r>
-        <w:t>debuffs</w:t>
-      </w:r>
-      <w:proofErr w:type="spellEnd"/>
-      <w:r>
-        <w:t xml:space="preserve"> en het implementeren van alle obstakels.</w:t>
+        <w:t>In sprint 3 hebben we verder gewerkt aan de game. Ik heb zelf de user story rondom object pooling afgerond. We werkten als team aan de game, waarbij mijn bijdrage vooral lag bij het optimaliseren van de prestaties met behulp van object pooling. Sommige onderdelen zijn nog niet af, zoals het toepassen van debuffs en het implementeren van alle obstakels.</w:t>
       </w:r>
     </w:p>
     <w:p>
@@ -4139,15 +3912,7 @@
         </w:rPr>
       </w:pPr>
       <w:r>
-        <w:t xml:space="preserve">Ik heb geleerd hoe object pooling werkt en hoe ik het effectief kan toepassen binnen </w:t>
-      </w:r>
-      <w:proofErr w:type="spellStart"/>
-      <w:r>
-        <w:t>Unity</w:t>
-      </w:r>
-      <w:proofErr w:type="spellEnd"/>
-      <w:r>
-        <w:t>. Daarnaast heb ik ingezien dat het verstandig is om eerder te beginnen met het voorbereiden van de voortgangspresentatie</w:t>
+        <w:t>Ik heb geleerd hoe object pooling werkt en hoe ik het effectief kan toepassen binnen Unity. Daarnaast heb ik ingezien dat het verstandig is om eerder te beginnen met het voorbereiden van de voortgangspresentatie</w:t>
       </w:r>
       <w:r>
         <w:rPr>
@@ -4266,15 +4031,7 @@
     </w:p>
     <w:p>
       <w:r>
-        <w:t xml:space="preserve">Ik voelde me goed tijdens deze sprint. De </w:t>
-      </w:r>
-      <w:proofErr w:type="spellStart"/>
-      <w:r>
-        <w:t>workload</w:t>
-      </w:r>
-      <w:proofErr w:type="spellEnd"/>
-      <w:r>
-        <w:t xml:space="preserve"> was goed te doen en ik heb geen stress ervaren.</w:t>
+        <w:t>Ik voelde me goed tijdens deze sprint. De workload was goed te doen en ik heb geen stress ervaren.</w:t>
       </w:r>
     </w:p>
     <w:p>
@@ -4302,23 +4059,7 @@
     </w:p>
     <w:p>
       <w:r>
-        <w:t xml:space="preserve">Voor sprint 4 wil ik werken aan de obstakels en het correct laten werken van de </w:t>
-      </w:r>
-      <w:proofErr w:type="spellStart"/>
-      <w:r>
-        <w:t>debuffs</w:t>
-      </w:r>
-      <w:proofErr w:type="spellEnd"/>
-      <w:r>
-        <w:t xml:space="preserve">. Daarnaast wil ik mij vooral focussen op het bijhouden van </w:t>
-      </w:r>
-      <w:proofErr w:type="spellStart"/>
-      <w:r>
-        <w:t>laps</w:t>
-      </w:r>
-      <w:proofErr w:type="spellEnd"/>
-      <w:r>
-        <w:t xml:space="preserve"> en rondes binnen de game.</w:t>
+        <w:t>Voor sprint 4 wil ik werken aan de obstakels en het correct laten werken van de debuffs. Daarnaast wil ik mij vooral focussen op het bijhouden van laps en rondes binnen de game.</w:t>
       </w:r>
       <w:r>
         <w:br w:type="page"/>
@@ -4376,15 +4117,7 @@
           <w:b/>
           <w:bCs/>
         </w:rPr>
-        <w:t xml:space="preserve"> </w:t>
-      </w:r>
-      <w:proofErr w:type="spellStart"/>
-      <w:r>
-        <w:rPr>
-          <w:b/>
-          <w:bCs/>
-        </w:rPr>
-        <w:t>StandUp</w:t>
+        <w:t xml:space="preserve"> StandUp</w:t>
       </w:r>
       <w:r>
         <w:rPr>
@@ -4393,7 +4126,6 @@
         </w:rPr>
         <w:t>s</w:t>
       </w:r>
-      <w:proofErr w:type="spellEnd"/>
       <w:r>
         <w:rPr>
           <w:b/>
@@ -4401,20 +4133,438 @@
         </w:rPr>
         <w:t xml:space="preserve">. </w:t>
       </w:r>
-      <w:r>
-        <w:rPr>
-          <w:b/>
-          <w:bCs/>
-        </w:rPr>
-        <w:br/>
-      </w:r>
-      <w:r>
-        <w:rPr>
-          <w:i/>
-          <w:iCs/>
-        </w:rPr>
-        <w:t>…</w:t>
-      </w:r>
+    </w:p>
+    <w:p>
+      <w:pPr>
+        <w:pStyle w:val="Lijstalinea"/>
+        <w:ind w:left="360"/>
+      </w:pPr>
+      <w:r>
+        <w:rPr>
+          <w:i/>
+          <w:iCs/>
+        </w:rPr>
+        <w:drawing>
+          <wp:inline distT="0" distB="0" distL="0" distR="0" wp14:anchorId="5CB8BF59" wp14:editId="7E780AE3">
+            <wp:extent cx="3791479" cy="3943900"/>
+            <wp:effectExtent l="0" t="0" r="0" b="0"/>
+            <wp:docPr id="132080087" name="Afbeelding 1" descr="Afbeelding met tekst, schermopname, Lettertype&#10;&#10;Door AI gegenereerde inhoud is mogelijk onjuist."/>
+            <wp:cNvGraphicFramePr>
+              <a:graphicFrameLocks xmlns:a="http://schemas.openxmlformats.org/drawingml/2006/main" noChangeAspect="1"/>
+            </wp:cNvGraphicFramePr>
+            <a:graphic xmlns:a="http://schemas.openxmlformats.org/drawingml/2006/main">
+              <a:graphicData uri="http://schemas.openxmlformats.org/drawingml/2006/picture">
+                <pic:pic xmlns:pic="http://schemas.openxmlformats.org/drawingml/2006/picture">
+                  <pic:nvPicPr>
+                    <pic:cNvPr id="132080087" name="Afbeelding 1" descr="Afbeelding met tekst, schermopname, Lettertype&#10;&#10;Door AI gegenereerde inhoud is mogelijk onjuist."/>
+                    <pic:cNvPicPr/>
+                  </pic:nvPicPr>
+                  <pic:blipFill>
+                    <a:blip r:embed="rId40"/>
+                    <a:stretch>
+                      <a:fillRect/>
+                    </a:stretch>
+                  </pic:blipFill>
+                  <pic:spPr>
+                    <a:xfrm>
+                      <a:off x="0" y="0"/>
+                      <a:ext cx="3791479" cy="3943900"/>
+                    </a:xfrm>
+                    <a:prstGeom prst="rect">
+                      <a:avLst/>
+                    </a:prstGeom>
+                  </pic:spPr>
+                </pic:pic>
+              </a:graphicData>
+            </a:graphic>
+          </wp:inline>
+        </w:drawing>
+      </w:r>
+    </w:p>
+    <w:p>
+      <w:pPr>
+        <w:pStyle w:val="Lijstalinea"/>
+        <w:ind w:left="360"/>
+      </w:pPr>
+      <w:r>
+        <w:rPr>
+          <w:i/>
+          <w:iCs/>
+        </w:rPr>
+        <w:drawing>
+          <wp:inline distT="0" distB="0" distL="0" distR="0" wp14:anchorId="0AFE6F7B" wp14:editId="0B4276B2">
+            <wp:extent cx="5744377" cy="4048690"/>
+            <wp:effectExtent l="0" t="0" r="8890" b="9525"/>
+            <wp:docPr id="1132185894" name="Afbeelding 1" descr="Afbeelding met tekst, schermopname, Lettertype&#10;&#10;Door AI gegenereerde inhoud is mogelijk onjuist."/>
+            <wp:cNvGraphicFramePr>
+              <a:graphicFrameLocks xmlns:a="http://schemas.openxmlformats.org/drawingml/2006/main" noChangeAspect="1"/>
+            </wp:cNvGraphicFramePr>
+            <a:graphic xmlns:a="http://schemas.openxmlformats.org/drawingml/2006/main">
+              <a:graphicData uri="http://schemas.openxmlformats.org/drawingml/2006/picture">
+                <pic:pic xmlns:pic="http://schemas.openxmlformats.org/drawingml/2006/picture">
+                  <pic:nvPicPr>
+                    <pic:cNvPr id="1132185894" name="Afbeelding 1" descr="Afbeelding met tekst, schermopname, Lettertype&#10;&#10;Door AI gegenereerde inhoud is mogelijk onjuist."/>
+                    <pic:cNvPicPr/>
+                  </pic:nvPicPr>
+                  <pic:blipFill>
+                    <a:blip r:embed="rId41"/>
+                    <a:stretch>
+                      <a:fillRect/>
+                    </a:stretch>
+                  </pic:blipFill>
+                  <pic:spPr>
+                    <a:xfrm>
+                      <a:off x="0" y="0"/>
+                      <a:ext cx="5744377" cy="4048690"/>
+                    </a:xfrm>
+                    <a:prstGeom prst="rect">
+                      <a:avLst/>
+                    </a:prstGeom>
+                  </pic:spPr>
+                </pic:pic>
+              </a:graphicData>
+            </a:graphic>
+          </wp:inline>
+        </w:drawing>
+      </w:r>
+    </w:p>
+    <w:p>
+      <w:pPr>
+        <w:pStyle w:val="Lijstalinea"/>
+        <w:ind w:left="360"/>
+      </w:pPr>
+      <w:r>
+        <w:rPr>
+          <w:i/>
+          <w:iCs/>
+        </w:rPr>
+        <w:lastRenderedPageBreak/>
+        <w:drawing>
+          <wp:inline distT="0" distB="0" distL="0" distR="0" wp14:anchorId="5AFCB9F6" wp14:editId="56A51F1F">
+            <wp:extent cx="5760720" cy="2426335"/>
+            <wp:effectExtent l="0" t="0" r="0" b="0"/>
+            <wp:docPr id="1374897834" name="Afbeelding 1" descr="Afbeelding met tekst, schermopname, Lettertype&#10;&#10;Door AI gegenereerde inhoud is mogelijk onjuist."/>
+            <wp:cNvGraphicFramePr>
+              <a:graphicFrameLocks xmlns:a="http://schemas.openxmlformats.org/drawingml/2006/main" noChangeAspect="1"/>
+            </wp:cNvGraphicFramePr>
+            <a:graphic xmlns:a="http://schemas.openxmlformats.org/drawingml/2006/main">
+              <a:graphicData uri="http://schemas.openxmlformats.org/drawingml/2006/picture">
+                <pic:pic xmlns:pic="http://schemas.openxmlformats.org/drawingml/2006/picture">
+                  <pic:nvPicPr>
+                    <pic:cNvPr id="1374897834" name="Afbeelding 1" descr="Afbeelding met tekst, schermopname, Lettertype&#10;&#10;Door AI gegenereerde inhoud is mogelijk onjuist."/>
+                    <pic:cNvPicPr/>
+                  </pic:nvPicPr>
+                  <pic:blipFill>
+                    <a:blip r:embed="rId42"/>
+                    <a:stretch>
+                      <a:fillRect/>
+                    </a:stretch>
+                  </pic:blipFill>
+                  <pic:spPr>
+                    <a:xfrm>
+                      <a:off x="0" y="0"/>
+                      <a:ext cx="5760720" cy="2426335"/>
+                    </a:xfrm>
+                    <a:prstGeom prst="rect">
+                      <a:avLst/>
+                    </a:prstGeom>
+                  </pic:spPr>
+                </pic:pic>
+              </a:graphicData>
+            </a:graphic>
+          </wp:inline>
+        </w:drawing>
+      </w:r>
+    </w:p>
+    <w:p>
+      <w:pPr>
+        <w:pStyle w:val="Lijstalinea"/>
+        <w:ind w:left="360"/>
+      </w:pPr>
+      <w:r>
+        <w:rPr>
+          <w:i/>
+          <w:iCs/>
+        </w:rPr>
+        <w:drawing>
+          <wp:inline distT="0" distB="0" distL="0" distR="0" wp14:anchorId="7DC8A477" wp14:editId="47D3A159">
+            <wp:extent cx="5096586" cy="2857899"/>
+            <wp:effectExtent l="0" t="0" r="0" b="0"/>
+            <wp:docPr id="1938266270" name="Afbeelding 1" descr="Afbeelding met tekst, schermopname, Lettertype, nummer&#10;&#10;Door AI gegenereerde inhoud is mogelijk onjuist."/>
+            <wp:cNvGraphicFramePr>
+              <a:graphicFrameLocks xmlns:a="http://schemas.openxmlformats.org/drawingml/2006/main" noChangeAspect="1"/>
+            </wp:cNvGraphicFramePr>
+            <a:graphic xmlns:a="http://schemas.openxmlformats.org/drawingml/2006/main">
+              <a:graphicData uri="http://schemas.openxmlformats.org/drawingml/2006/picture">
+                <pic:pic xmlns:pic="http://schemas.openxmlformats.org/drawingml/2006/picture">
+                  <pic:nvPicPr>
+                    <pic:cNvPr id="1938266270" name="Afbeelding 1" descr="Afbeelding met tekst, schermopname, Lettertype, nummer&#10;&#10;Door AI gegenereerde inhoud is mogelijk onjuist."/>
+                    <pic:cNvPicPr/>
+                  </pic:nvPicPr>
+                  <pic:blipFill>
+                    <a:blip r:embed="rId43"/>
+                    <a:stretch>
+                      <a:fillRect/>
+                    </a:stretch>
+                  </pic:blipFill>
+                  <pic:spPr>
+                    <a:xfrm>
+                      <a:off x="0" y="0"/>
+                      <a:ext cx="5096586" cy="2857899"/>
+                    </a:xfrm>
+                    <a:prstGeom prst="rect">
+                      <a:avLst/>
+                    </a:prstGeom>
+                  </pic:spPr>
+                </pic:pic>
+              </a:graphicData>
+            </a:graphic>
+          </wp:inline>
+        </w:drawing>
+      </w:r>
+    </w:p>
+    <w:p>
+      <w:pPr>
+        <w:pStyle w:val="Lijstalinea"/>
+        <w:ind w:left="360"/>
+      </w:pPr>
+      <w:r>
+        <w:rPr>
+          <w:i/>
+          <w:iCs/>
+        </w:rPr>
+        <w:drawing>
+          <wp:inline distT="0" distB="0" distL="0" distR="0" wp14:anchorId="3EF1EC65" wp14:editId="359779F4">
+            <wp:extent cx="5096586" cy="2638793"/>
+            <wp:effectExtent l="0" t="0" r="8890" b="9525"/>
+            <wp:docPr id="2097890618" name="Afbeelding 1" descr="Afbeelding met tekst, schermopname, Lettertype&#10;&#10;Door AI gegenereerde inhoud is mogelijk onjuist."/>
+            <wp:cNvGraphicFramePr>
+              <a:graphicFrameLocks xmlns:a="http://schemas.openxmlformats.org/drawingml/2006/main" noChangeAspect="1"/>
+            </wp:cNvGraphicFramePr>
+            <a:graphic xmlns:a="http://schemas.openxmlformats.org/drawingml/2006/main">
+              <a:graphicData uri="http://schemas.openxmlformats.org/drawingml/2006/picture">
+                <pic:pic xmlns:pic="http://schemas.openxmlformats.org/drawingml/2006/picture">
+                  <pic:nvPicPr>
+                    <pic:cNvPr id="2097890618" name="Afbeelding 1" descr="Afbeelding met tekst, schermopname, Lettertype&#10;&#10;Door AI gegenereerde inhoud is mogelijk onjuist."/>
+                    <pic:cNvPicPr/>
+                  </pic:nvPicPr>
+                  <pic:blipFill>
+                    <a:blip r:embed="rId44"/>
+                    <a:stretch>
+                      <a:fillRect/>
+                    </a:stretch>
+                  </pic:blipFill>
+                  <pic:spPr>
+                    <a:xfrm>
+                      <a:off x="0" y="0"/>
+                      <a:ext cx="5096586" cy="2638793"/>
+                    </a:xfrm>
+                    <a:prstGeom prst="rect">
+                      <a:avLst/>
+                    </a:prstGeom>
+                  </pic:spPr>
+                </pic:pic>
+              </a:graphicData>
+            </a:graphic>
+          </wp:inline>
+        </w:drawing>
+      </w:r>
+    </w:p>
+    <w:p>
+      <w:pPr>
+        <w:pStyle w:val="Lijstalinea"/>
+        <w:ind w:left="360"/>
+      </w:pPr>
+      <w:r>
+        <w:rPr>
+          <w:i/>
+          <w:iCs/>
+        </w:rPr>
+        <w:lastRenderedPageBreak/>
+        <w:drawing>
+          <wp:inline distT="0" distB="0" distL="0" distR="0" wp14:anchorId="62350D46" wp14:editId="428FB101">
+            <wp:extent cx="4601217" cy="3629532"/>
+            <wp:effectExtent l="0" t="0" r="0" b="9525"/>
+            <wp:docPr id="1095652813" name="Afbeelding 1" descr="Afbeelding met tekst, schermopname, Lettertype&#10;&#10;Door AI gegenereerde inhoud is mogelijk onjuist."/>
+            <wp:cNvGraphicFramePr>
+              <a:graphicFrameLocks xmlns:a="http://schemas.openxmlformats.org/drawingml/2006/main" noChangeAspect="1"/>
+            </wp:cNvGraphicFramePr>
+            <a:graphic xmlns:a="http://schemas.openxmlformats.org/drawingml/2006/main">
+              <a:graphicData uri="http://schemas.openxmlformats.org/drawingml/2006/picture">
+                <pic:pic xmlns:pic="http://schemas.openxmlformats.org/drawingml/2006/picture">
+                  <pic:nvPicPr>
+                    <pic:cNvPr id="1095652813" name="Afbeelding 1" descr="Afbeelding met tekst, schermopname, Lettertype&#10;&#10;Door AI gegenereerde inhoud is mogelijk onjuist."/>
+                    <pic:cNvPicPr/>
+                  </pic:nvPicPr>
+                  <pic:blipFill>
+                    <a:blip r:embed="rId45"/>
+                    <a:stretch>
+                      <a:fillRect/>
+                    </a:stretch>
+                  </pic:blipFill>
+                  <pic:spPr>
+                    <a:xfrm>
+                      <a:off x="0" y="0"/>
+                      <a:ext cx="4601217" cy="3629532"/>
+                    </a:xfrm>
+                    <a:prstGeom prst="rect">
+                      <a:avLst/>
+                    </a:prstGeom>
+                  </pic:spPr>
+                </pic:pic>
+              </a:graphicData>
+            </a:graphic>
+          </wp:inline>
+        </w:drawing>
+      </w:r>
+    </w:p>
+    <w:p>
+      <w:pPr>
+        <w:pStyle w:val="Lijstalinea"/>
+        <w:ind w:left="360"/>
+      </w:pPr>
+      <w:r>
+        <w:rPr>
+          <w:i/>
+          <w:iCs/>
+        </w:rPr>
+        <w:drawing>
+          <wp:inline distT="0" distB="0" distL="0" distR="0" wp14:anchorId="0C773E2D" wp14:editId="66D8FEF1">
+            <wp:extent cx="3419952" cy="2114845"/>
+            <wp:effectExtent l="0" t="0" r="9525" b="0"/>
+            <wp:docPr id="398587532" name="Afbeelding 1" descr="Afbeelding met tekst, schermopname, Lettertype&#10;&#10;Door AI gegenereerde inhoud is mogelijk onjuist."/>
+            <wp:cNvGraphicFramePr>
+              <a:graphicFrameLocks xmlns:a="http://schemas.openxmlformats.org/drawingml/2006/main" noChangeAspect="1"/>
+            </wp:cNvGraphicFramePr>
+            <a:graphic xmlns:a="http://schemas.openxmlformats.org/drawingml/2006/main">
+              <a:graphicData uri="http://schemas.openxmlformats.org/drawingml/2006/picture">
+                <pic:pic xmlns:pic="http://schemas.openxmlformats.org/drawingml/2006/picture">
+                  <pic:nvPicPr>
+                    <pic:cNvPr id="398587532" name="Afbeelding 1" descr="Afbeelding met tekst, schermopname, Lettertype&#10;&#10;Door AI gegenereerde inhoud is mogelijk onjuist."/>
+                    <pic:cNvPicPr/>
+                  </pic:nvPicPr>
+                  <pic:blipFill>
+                    <a:blip r:embed="rId46"/>
+                    <a:stretch>
+                      <a:fillRect/>
+                    </a:stretch>
+                  </pic:blipFill>
+                  <pic:spPr>
+                    <a:xfrm>
+                      <a:off x="0" y="0"/>
+                      <a:ext cx="3419952" cy="2114845"/>
+                    </a:xfrm>
+                    <a:prstGeom prst="rect">
+                      <a:avLst/>
+                    </a:prstGeom>
+                  </pic:spPr>
+                </pic:pic>
+              </a:graphicData>
+            </a:graphic>
+          </wp:inline>
+        </w:drawing>
+      </w:r>
+    </w:p>
+    <w:p>
+      <w:pPr>
+        <w:pStyle w:val="Lijstalinea"/>
+        <w:ind w:left="360"/>
+      </w:pPr>
+      <w:r>
+        <w:rPr>
+          <w:i/>
+          <w:iCs/>
+        </w:rPr>
+        <w:drawing>
+          <wp:inline distT="0" distB="0" distL="0" distR="0" wp14:anchorId="110AF1DA" wp14:editId="396CA84C">
+            <wp:extent cx="5760720" cy="2034540"/>
+            <wp:effectExtent l="0" t="0" r="0" b="3810"/>
+            <wp:docPr id="209181604" name="Afbeelding 1" descr="Afbeelding met tekst, schermopname, Lettertype&#10;&#10;Door AI gegenereerde inhoud is mogelijk onjuist."/>
+            <wp:cNvGraphicFramePr>
+              <a:graphicFrameLocks xmlns:a="http://schemas.openxmlformats.org/drawingml/2006/main" noChangeAspect="1"/>
+            </wp:cNvGraphicFramePr>
+            <a:graphic xmlns:a="http://schemas.openxmlformats.org/drawingml/2006/main">
+              <a:graphicData uri="http://schemas.openxmlformats.org/drawingml/2006/picture">
+                <pic:pic xmlns:pic="http://schemas.openxmlformats.org/drawingml/2006/picture">
+                  <pic:nvPicPr>
+                    <pic:cNvPr id="209181604" name="Afbeelding 1" descr="Afbeelding met tekst, schermopname, Lettertype&#10;&#10;Door AI gegenereerde inhoud is mogelijk onjuist."/>
+                    <pic:cNvPicPr/>
+                  </pic:nvPicPr>
+                  <pic:blipFill>
+                    <a:blip r:embed="rId47"/>
+                    <a:stretch>
+                      <a:fillRect/>
+                    </a:stretch>
+                  </pic:blipFill>
+                  <pic:spPr>
+                    <a:xfrm>
+                      <a:off x="0" y="0"/>
+                      <a:ext cx="5760720" cy="2034540"/>
+                    </a:xfrm>
+                    <a:prstGeom prst="rect">
+                      <a:avLst/>
+                    </a:prstGeom>
+                  </pic:spPr>
+                </pic:pic>
+              </a:graphicData>
+            </a:graphic>
+          </wp:inline>
+        </w:drawing>
+      </w:r>
+    </w:p>
+    <w:p>
+      <w:pPr>
+        <w:pStyle w:val="Lijstalinea"/>
+        <w:ind w:left="360"/>
+      </w:pPr>
+      <w:r>
+        <w:rPr>
+          <w:i/>
+          <w:iCs/>
+        </w:rPr>
+        <w:lastRenderedPageBreak/>
+        <w:drawing>
+          <wp:inline distT="0" distB="0" distL="0" distR="0" wp14:anchorId="60900F56" wp14:editId="24DADE8E">
+            <wp:extent cx="3277057" cy="3296110"/>
+            <wp:effectExtent l="0" t="0" r="0" b="0"/>
+            <wp:docPr id="1679962597" name="Afbeelding 1" descr="Afbeelding met tekst, schermopname, Lettertype, algebra&#10;&#10;Door AI gegenereerde inhoud is mogelijk onjuist."/>
+            <wp:cNvGraphicFramePr>
+              <a:graphicFrameLocks xmlns:a="http://schemas.openxmlformats.org/drawingml/2006/main" noChangeAspect="1"/>
+            </wp:cNvGraphicFramePr>
+            <a:graphic xmlns:a="http://schemas.openxmlformats.org/drawingml/2006/main">
+              <a:graphicData uri="http://schemas.openxmlformats.org/drawingml/2006/picture">
+                <pic:pic xmlns:pic="http://schemas.openxmlformats.org/drawingml/2006/picture">
+                  <pic:nvPicPr>
+                    <pic:cNvPr id="1679962597" name="Afbeelding 1" descr="Afbeelding met tekst, schermopname, Lettertype, algebra&#10;&#10;Door AI gegenereerde inhoud is mogelijk onjuist."/>
+                    <pic:cNvPicPr/>
+                  </pic:nvPicPr>
+                  <pic:blipFill>
+                    <a:blip r:embed="rId48"/>
+                    <a:stretch>
+                      <a:fillRect/>
+                    </a:stretch>
+                  </pic:blipFill>
+                  <pic:spPr>
+                    <a:xfrm>
+                      <a:off x="0" y="0"/>
+                      <a:ext cx="3277057" cy="3296110"/>
+                    </a:xfrm>
+                    <a:prstGeom prst="rect">
+                      <a:avLst/>
+                    </a:prstGeom>
+                  </pic:spPr>
+                </pic:pic>
+              </a:graphicData>
+            </a:graphic>
+          </wp:inline>
+        </w:drawing>
+      </w:r>
+    </w:p>
+    <w:p>
+      <w:pPr>
+        <w:pStyle w:val="Lijstalinea"/>
+        <w:ind w:left="360"/>
+      </w:pPr>
       <w:r>
         <w:rPr>
           <w:i/>
@@ -4464,7 +4614,7 @@
           <w:i/>
           <w:iCs/>
         </w:rPr>
-        <w:t>…</w:t>
+        <w:t>in sprint 4 hebben we de movement gereworked, meerdere obstakels toegevoegd, een leaderboard toegevoegd, debuffs en een slipstream mechanic</w:t>
       </w:r>
       <w:r>
         <w:rPr>
@@ -4501,7 +4651,7 @@
           <w:i/>
           <w:iCs/>
         </w:rPr>
-        <w:t>…</w:t>
+        <w:t xml:space="preserve">mogelijke uitdagingen momenteel zijn bugs fixen en alles samen voegen voor het einde van deze sprint. </w:t>
       </w:r>
       <w:r>
         <w:rPr>
@@ -4538,7 +4688,14 @@
           <w:i/>
           <w:iCs/>
         </w:rPr>
-        <w:t>…</w:t>
+        <w:t xml:space="preserve">ik heb geleerd dat notities maken van wat er moet gebeuren na een vacantie </w:t>
+      </w:r>
+      <w:r>
+        <w:rPr>
+          <w:i/>
+          <w:iCs/>
+        </w:rPr>
+        <w:t>kan helpen met het draad oppakken na een lange tijd niet meer gewerkt hebben</w:t>
       </w:r>
       <w:r>
         <w:rPr>
@@ -4575,7 +4732,7 @@
           <w:i/>
           <w:iCs/>
         </w:rPr>
-        <w:t>…</w:t>
+        <w:t>ik heb geen vragen of onduidelijkheden</w:t>
       </w:r>
       <w:r>
         <w:rPr>
@@ -4636,7 +4793,7 @@
           <w:i/>
           <w:iCs/>
         </w:rPr>
-        <w:t>…</w:t>
+        <w:t>probeer de draag sneller op te pakken na een vacantie</w:t>
       </w:r>
       <w:r>
         <w:rPr>
@@ -4691,7 +4848,7 @@
           <w:i/>
           <w:iCs/>
         </w:rPr>
-        <w:t>…</w:t>
+        <w:t>probeer de draag sneller op te pakken na een vacantie</w:t>
       </w:r>
       <w:r>
         <w:rPr>
@@ -4728,7 +4885,7 @@
           <w:i/>
           <w:iCs/>
         </w:rPr>
-        <w:t>…</w:t>
+        <w:t>ik voel me heel goed, ben bij, in my lane, thriving</w:t>
       </w:r>
       <w:r>
         <w:rPr>
@@ -4765,7 +4922,7 @@
         <w:br/>
       </w:r>
       <w:r>
-        <w:t>…</w:t>
+        <w:t>bugs fixen, restarten van een race af krijgen, alles samen voegen.</w:t>
       </w:r>
     </w:p>
     <w:p>
@@ -4777,9 +4934,9 @@
       </w:pPr>
     </w:p>
     <w:sectPr>
-      <w:footerReference w:type="default" r:id="rId40"/>
-      <w:headerReference w:type="first" r:id="rId41"/>
-      <w:footerReference w:type="first" r:id="rId42"/>
+      <w:footerReference w:type="default" r:id="rId49"/>
+      <w:headerReference w:type="first" r:id="rId50"/>
+      <w:footerReference w:type="first" r:id="rId51"/>
       <w:pgSz w:w="11906" w:h="16838"/>
       <w:pgMar w:top="1417" w:right="1417" w:bottom="1417" w:left="1417" w:header="708" w:footer="708" w:gutter="0"/>
       <w:cols w:space="708"/>
@@ -4931,7 +5088,6 @@
       </w:rPr>
       <w:t xml:space="preserve">             </w:t>
     </w:r>
-    <w:proofErr w:type="spellStart"/>
     <w:r>
       <w:rPr>
         <w:color w:val="000000"/>
@@ -4939,17 +5095,7 @@
         <w:szCs w:val="16"/>
         <w:lang w:val="en-US"/>
       </w:rPr>
-      <w:t>Sjabloon</w:t>
-    </w:r>
-    <w:proofErr w:type="spellEnd"/>
-    <w:r>
-      <w:rPr>
-        <w:color w:val="000000"/>
-        <w:sz w:val="16"/>
-        <w:szCs w:val="16"/>
-        <w:lang w:val="en-US"/>
-      </w:rPr>
-      <w:t xml:space="preserve"> </w:t>
+      <w:t xml:space="preserve">Sjabloon </w:t>
     </w:r>
     <w:r>
       <w:rPr>
@@ -9636,6 +9782,7 @@
   <w:style w:type="character" w:default="1" w:styleId="Standaardalinea-lettertype">
     <w:name w:val="Default Paragraph Font"/>
     <w:uiPriority w:val="1"/>
+    <w:semiHidden/>
     <w:unhideWhenUsed/>
   </w:style>
   <w:style w:type="table" w:default="1" w:styleId="Standaardtabel">
@@ -10346,12 +10493,14 @@
 </file>
 
 <file path=customXml/item2.xml><?xml version="1.0" encoding="utf-8"?>
-<?mso-contentType ?>
-<FormTemplates xmlns="http://schemas.microsoft.com/sharepoint/v3/contenttype/forms">
-  <Display>DocumentLibraryForm</Display>
-  <Edit>DocumentLibraryForm</Edit>
-  <New>DocumentLibraryForm</New>
-</FormTemplates>
+<p:properties xmlns:p="http://schemas.microsoft.com/office/2006/metadata/properties" xmlns:xsi="http://www.w3.org/2001/XMLSchema-instance" xmlns:pc="http://schemas.microsoft.com/office/infopath/2007/PartnerControls">
+  <documentManagement>
+    <TaxCatchAll xmlns="32dd6115-ce5d-46b4-b638-9e7d5ca6cbee" xsi:nil="true"/>
+    <lcf76f155ced4ddcb4097134ff3c332f xmlns="094ecc41-7a37-40c9-8390-f18431712098">
+      <Terms xmlns="http://schemas.microsoft.com/office/infopath/2007/PartnerControls"/>
+    </lcf76f155ced4ddcb4097134ff3c332f>
+  </documentManagement>
+</p:properties>
 </file>
 
 <file path=customXml/item3.xml><?xml version="1.0" encoding="utf-8"?>
@@ -10590,14 +10739,12 @@
 </file>
 
 <file path=customXml/item4.xml><?xml version="1.0" encoding="utf-8"?>
-<p:properties xmlns:p="http://schemas.microsoft.com/office/2006/metadata/properties" xmlns:xsi="http://www.w3.org/2001/XMLSchema-instance" xmlns:pc="http://schemas.microsoft.com/office/infopath/2007/PartnerControls">
-  <documentManagement>
-    <TaxCatchAll xmlns="32dd6115-ce5d-46b4-b638-9e7d5ca6cbee" xsi:nil="true"/>
-    <lcf76f155ced4ddcb4097134ff3c332f xmlns="094ecc41-7a37-40c9-8390-f18431712098">
-      <Terms xmlns="http://schemas.microsoft.com/office/infopath/2007/PartnerControls"/>
-    </lcf76f155ced4ddcb4097134ff3c332f>
-  </documentManagement>
-</p:properties>
+<?mso-contentType ?>
+<FormTemplates xmlns="http://schemas.microsoft.com/sharepoint/v3/contenttype/forms">
+  <Display>DocumentLibraryForm</Display>
+  <Edit>DocumentLibraryForm</Edit>
+  <New>DocumentLibraryForm</New>
+</FormTemplates>
 </file>
 
 <file path=customXml/itemProps1.xml><?xml version="1.0" encoding="utf-8"?>
@@ -10609,9 +10756,12 @@
 </file>
 
 <file path=customXml/itemProps2.xml><?xml version="1.0" encoding="utf-8"?>
-<ds:datastoreItem xmlns:ds="http://schemas.openxmlformats.org/officeDocument/2006/customXml" ds:itemID="{C6916C6B-E06E-47CD-A094-BBBE44C5EA8C}">
+<ds:datastoreItem xmlns:ds="http://schemas.openxmlformats.org/officeDocument/2006/customXml" ds:itemID="{846B1C81-E993-40E7-BCC5-DA63F0CD945C}">
   <ds:schemaRefs>
-    <ds:schemaRef ds:uri="http://schemas.microsoft.com/sharepoint/v3/contenttype/forms"/>
+    <ds:schemaRef ds:uri="http://schemas.microsoft.com/office/2006/metadata/properties"/>
+    <ds:schemaRef ds:uri="http://schemas.microsoft.com/office/infopath/2007/PartnerControls"/>
+    <ds:schemaRef ds:uri="32dd6115-ce5d-46b4-b638-9e7d5ca6cbee"/>
+    <ds:schemaRef ds:uri="094ecc41-7a37-40c9-8390-f18431712098"/>
   </ds:schemaRefs>
 </ds:datastoreItem>
 </file>
@@ -10636,12 +10786,9 @@
 </file>
 
 <file path=customXml/itemProps4.xml><?xml version="1.0" encoding="utf-8"?>
-<ds:datastoreItem xmlns:ds="http://schemas.openxmlformats.org/officeDocument/2006/customXml" ds:itemID="{846B1C81-E993-40E7-BCC5-DA63F0CD945C}">
+<ds:datastoreItem xmlns:ds="http://schemas.openxmlformats.org/officeDocument/2006/customXml" ds:itemID="{C6916C6B-E06E-47CD-A094-BBBE44C5EA8C}">
   <ds:schemaRefs>
-    <ds:schemaRef ds:uri="http://schemas.microsoft.com/office/2006/metadata/properties"/>
-    <ds:schemaRef ds:uri="http://schemas.microsoft.com/office/infopath/2007/PartnerControls"/>
-    <ds:schemaRef ds:uri="32dd6115-ce5d-46b4-b638-9e7d5ca6cbee"/>
-    <ds:schemaRef ds:uri="094ecc41-7a37-40c9-8390-f18431712098"/>
+    <ds:schemaRef ds:uri="http://schemas.microsoft.com/sharepoint/v3/contenttype/forms"/>
   </ds:schemaRefs>
 </ds:datastoreItem>
 </file>
</xml_diff>

<commit_message>
feat: gido log update
</commit_message>
<xml_diff>
--- a/Templates/Log/Sprint 2 - Log Gido Verhoef.docx
+++ b/Templates/Log/Sprint 2 - Log Gido Verhoef.docx
@@ -4143,6 +4143,7 @@
         <w:rPr>
           <w:i/>
           <w:iCs/>
+          <w:noProof/>
         </w:rPr>
         <w:drawing>
           <wp:inline distT="0" distB="0" distL="0" distR="0" wp14:anchorId="5CB8BF59" wp14:editId="7E780AE3">
@@ -4190,6 +4191,7 @@
         <w:rPr>
           <w:i/>
           <w:iCs/>
+          <w:noProof/>
         </w:rPr>
         <w:drawing>
           <wp:inline distT="0" distB="0" distL="0" distR="0" wp14:anchorId="0AFE6F7B" wp14:editId="0B4276B2">
@@ -4237,6 +4239,7 @@
         <w:rPr>
           <w:i/>
           <w:iCs/>
+          <w:noProof/>
         </w:rPr>
         <w:lastRenderedPageBreak/>
         <w:drawing>
@@ -4285,6 +4288,7 @@
         <w:rPr>
           <w:i/>
           <w:iCs/>
+          <w:noProof/>
         </w:rPr>
         <w:drawing>
           <wp:inline distT="0" distB="0" distL="0" distR="0" wp14:anchorId="7DC8A477" wp14:editId="47D3A159">
@@ -4332,6 +4336,7 @@
         <w:rPr>
           <w:i/>
           <w:iCs/>
+          <w:noProof/>
         </w:rPr>
         <w:drawing>
           <wp:inline distT="0" distB="0" distL="0" distR="0" wp14:anchorId="3EF1EC65" wp14:editId="359779F4">
@@ -4379,6 +4384,7 @@
         <w:rPr>
           <w:i/>
           <w:iCs/>
+          <w:noProof/>
         </w:rPr>
         <w:lastRenderedPageBreak/>
         <w:drawing>
@@ -4427,6 +4433,7 @@
         <w:rPr>
           <w:i/>
           <w:iCs/>
+          <w:noProof/>
         </w:rPr>
         <w:drawing>
           <wp:inline distT="0" distB="0" distL="0" distR="0" wp14:anchorId="0C773E2D" wp14:editId="66D8FEF1">
@@ -4474,6 +4481,7 @@
         <w:rPr>
           <w:i/>
           <w:iCs/>
+          <w:noProof/>
         </w:rPr>
         <w:drawing>
           <wp:inline distT="0" distB="0" distL="0" distR="0" wp14:anchorId="110AF1DA" wp14:editId="396CA84C">
@@ -4521,6 +4529,7 @@
         <w:rPr>
           <w:i/>
           <w:iCs/>
+          <w:noProof/>
         </w:rPr>
         <w:lastRenderedPageBreak/>
         <w:drawing>
@@ -4933,10 +4942,796 @@
         </w:rPr>
       </w:pPr>
     </w:p>
+    <w:p>
+      <w:pPr>
+        <w:pStyle w:val="Kop1"/>
+      </w:pPr>
+      <w:r>
+        <w:lastRenderedPageBreak/>
+        <w:t xml:space="preserve">Sprint </w:t>
+      </w:r>
+      <w:r>
+        <w:t>5</w:t>
+      </w:r>
+    </w:p>
+    <w:p>
+      <w:pPr>
+        <w:pStyle w:val="Lijstalinea"/>
+        <w:numPr>
+          <w:ilvl w:val="0"/>
+          <w:numId w:val="41"/>
+        </w:numPr>
+      </w:pPr>
+      <w:r>
+        <w:rPr>
+          <w:b/>
+          <w:bCs/>
+        </w:rPr>
+        <w:t>Kopie/screenshot</w:t>
+      </w:r>
+      <w:r>
+        <w:rPr>
+          <w:b/>
+          <w:bCs/>
+        </w:rPr>
+        <w:t>s</w:t>
+      </w:r>
+      <w:r>
+        <w:rPr>
+          <w:b/>
+          <w:bCs/>
+        </w:rPr>
+        <w:t xml:space="preserve"> van je </w:t>
+      </w:r>
+      <w:r>
+        <w:rPr>
+          <w:b/>
+          <w:bCs/>
+        </w:rPr>
+        <w:t>DAILY</w:t>
+      </w:r>
+      <w:r>
+        <w:rPr>
+          <w:b/>
+          <w:bCs/>
+        </w:rPr>
+        <w:t xml:space="preserve"> StandUp</w:t>
+      </w:r>
+      <w:r>
+        <w:rPr>
+          <w:b/>
+          <w:bCs/>
+        </w:rPr>
+        <w:t>s</w:t>
+      </w:r>
+      <w:r>
+        <w:rPr>
+          <w:b/>
+          <w:bCs/>
+        </w:rPr>
+        <w:t xml:space="preserve">. </w:t>
+      </w:r>
+    </w:p>
+    <w:p>
+      <w:pPr>
+        <w:pStyle w:val="Lijstalinea"/>
+        <w:ind w:left="360"/>
+      </w:pPr>
+      <w:r>
+        <w:drawing>
+          <wp:inline distT="0" distB="0" distL="0" distR="0" wp14:anchorId="5695EE80" wp14:editId="5BE57F9D">
+            <wp:extent cx="4410691" cy="3286584"/>
+            <wp:effectExtent l="0" t="0" r="9525" b="9525"/>
+            <wp:docPr id="820866973" name="Afbeelding 1" descr="Afbeelding met tekst, schermopname, Lettertype&#10;&#10;Door AI gegenereerde inhoud is mogelijk onjuist."/>
+            <wp:cNvGraphicFramePr>
+              <a:graphicFrameLocks xmlns:a="http://schemas.openxmlformats.org/drawingml/2006/main" noChangeAspect="1"/>
+            </wp:cNvGraphicFramePr>
+            <a:graphic xmlns:a="http://schemas.openxmlformats.org/drawingml/2006/main">
+              <a:graphicData uri="http://schemas.openxmlformats.org/drawingml/2006/picture">
+                <pic:pic xmlns:pic="http://schemas.openxmlformats.org/drawingml/2006/picture">
+                  <pic:nvPicPr>
+                    <pic:cNvPr id="820866973" name="Afbeelding 1" descr="Afbeelding met tekst, schermopname, Lettertype&#10;&#10;Door AI gegenereerde inhoud is mogelijk onjuist."/>
+                    <pic:cNvPicPr/>
+                  </pic:nvPicPr>
+                  <pic:blipFill>
+                    <a:blip r:embed="rId49"/>
+                    <a:stretch>
+                      <a:fillRect/>
+                    </a:stretch>
+                  </pic:blipFill>
+                  <pic:spPr>
+                    <a:xfrm>
+                      <a:off x="0" y="0"/>
+                      <a:ext cx="4410691" cy="3286584"/>
+                    </a:xfrm>
+                    <a:prstGeom prst="rect">
+                      <a:avLst/>
+                    </a:prstGeom>
+                  </pic:spPr>
+                </pic:pic>
+              </a:graphicData>
+            </a:graphic>
+          </wp:inline>
+        </w:drawing>
+      </w:r>
+    </w:p>
+    <w:p>
+      <w:pPr>
+        <w:pStyle w:val="Lijstalinea"/>
+        <w:ind w:left="360"/>
+      </w:pPr>
+      <w:r>
+        <w:drawing>
+          <wp:inline distT="0" distB="0" distL="0" distR="0" wp14:anchorId="11623ED8" wp14:editId="57AFB9BD">
+            <wp:extent cx="3991532" cy="3258005"/>
+            <wp:effectExtent l="0" t="0" r="9525" b="0"/>
+            <wp:docPr id="274407881" name="Afbeelding 1" descr="Afbeelding met tekst, schermopname, Lettertype&#10;&#10;Door AI gegenereerde inhoud is mogelijk onjuist."/>
+            <wp:cNvGraphicFramePr>
+              <a:graphicFrameLocks xmlns:a="http://schemas.openxmlformats.org/drawingml/2006/main" noChangeAspect="1"/>
+            </wp:cNvGraphicFramePr>
+            <a:graphic xmlns:a="http://schemas.openxmlformats.org/drawingml/2006/main">
+              <a:graphicData uri="http://schemas.openxmlformats.org/drawingml/2006/picture">
+                <pic:pic xmlns:pic="http://schemas.openxmlformats.org/drawingml/2006/picture">
+                  <pic:nvPicPr>
+                    <pic:cNvPr id="274407881" name="Afbeelding 1" descr="Afbeelding met tekst, schermopname, Lettertype&#10;&#10;Door AI gegenereerde inhoud is mogelijk onjuist."/>
+                    <pic:cNvPicPr/>
+                  </pic:nvPicPr>
+                  <pic:blipFill>
+                    <a:blip r:embed="rId50"/>
+                    <a:stretch>
+                      <a:fillRect/>
+                    </a:stretch>
+                  </pic:blipFill>
+                  <pic:spPr>
+                    <a:xfrm>
+                      <a:off x="0" y="0"/>
+                      <a:ext cx="3991532" cy="3258005"/>
+                    </a:xfrm>
+                    <a:prstGeom prst="rect">
+                      <a:avLst/>
+                    </a:prstGeom>
+                  </pic:spPr>
+                </pic:pic>
+              </a:graphicData>
+            </a:graphic>
+          </wp:inline>
+        </w:drawing>
+      </w:r>
+    </w:p>
+    <w:p>
+      <w:pPr>
+        <w:pStyle w:val="Lijstalinea"/>
+        <w:ind w:left="360"/>
+      </w:pPr>
+      <w:r>
+        <w:lastRenderedPageBreak/>
+        <w:drawing>
+          <wp:inline distT="0" distB="0" distL="0" distR="0" wp14:anchorId="7B239BB2" wp14:editId="5DEED35D">
+            <wp:extent cx="4715533" cy="3715268"/>
+            <wp:effectExtent l="0" t="0" r="8890" b="0"/>
+            <wp:docPr id="1741785288" name="Afbeelding 1" descr="Afbeelding met tekst, schermopname, Lettertype&#10;&#10;Door AI gegenereerde inhoud is mogelijk onjuist."/>
+            <wp:cNvGraphicFramePr>
+              <a:graphicFrameLocks xmlns:a="http://schemas.openxmlformats.org/drawingml/2006/main" noChangeAspect="1"/>
+            </wp:cNvGraphicFramePr>
+            <a:graphic xmlns:a="http://schemas.openxmlformats.org/drawingml/2006/main">
+              <a:graphicData uri="http://schemas.openxmlformats.org/drawingml/2006/picture">
+                <pic:pic xmlns:pic="http://schemas.openxmlformats.org/drawingml/2006/picture">
+                  <pic:nvPicPr>
+                    <pic:cNvPr id="1741785288" name="Afbeelding 1" descr="Afbeelding met tekst, schermopname, Lettertype&#10;&#10;Door AI gegenereerde inhoud is mogelijk onjuist."/>
+                    <pic:cNvPicPr/>
+                  </pic:nvPicPr>
+                  <pic:blipFill>
+                    <a:blip r:embed="rId51"/>
+                    <a:stretch>
+                      <a:fillRect/>
+                    </a:stretch>
+                  </pic:blipFill>
+                  <pic:spPr>
+                    <a:xfrm>
+                      <a:off x="0" y="0"/>
+                      <a:ext cx="4715533" cy="3715268"/>
+                    </a:xfrm>
+                    <a:prstGeom prst="rect">
+                      <a:avLst/>
+                    </a:prstGeom>
+                  </pic:spPr>
+                </pic:pic>
+              </a:graphicData>
+            </a:graphic>
+          </wp:inline>
+        </w:drawing>
+      </w:r>
+    </w:p>
+    <w:p>
+      <w:pPr>
+        <w:pStyle w:val="Lijstalinea"/>
+        <w:ind w:left="360"/>
+      </w:pPr>
+      <w:r>
+        <w:drawing>
+          <wp:inline distT="0" distB="0" distL="0" distR="0" wp14:anchorId="6330DB1C" wp14:editId="619398DB">
+            <wp:extent cx="5760720" cy="3059430"/>
+            <wp:effectExtent l="0" t="0" r="0" b="7620"/>
+            <wp:docPr id="918593956" name="Afbeelding 1" descr="Afbeelding met tekst, schermopname, Lettertype&#10;&#10;Door AI gegenereerde inhoud is mogelijk onjuist."/>
+            <wp:cNvGraphicFramePr>
+              <a:graphicFrameLocks xmlns:a="http://schemas.openxmlformats.org/drawingml/2006/main" noChangeAspect="1"/>
+            </wp:cNvGraphicFramePr>
+            <a:graphic xmlns:a="http://schemas.openxmlformats.org/drawingml/2006/main">
+              <a:graphicData uri="http://schemas.openxmlformats.org/drawingml/2006/picture">
+                <pic:pic xmlns:pic="http://schemas.openxmlformats.org/drawingml/2006/picture">
+                  <pic:nvPicPr>
+                    <pic:cNvPr id="918593956" name="Afbeelding 1" descr="Afbeelding met tekst, schermopname, Lettertype&#10;&#10;Door AI gegenereerde inhoud is mogelijk onjuist."/>
+                    <pic:cNvPicPr/>
+                  </pic:nvPicPr>
+                  <pic:blipFill>
+                    <a:blip r:embed="rId52"/>
+                    <a:stretch>
+                      <a:fillRect/>
+                    </a:stretch>
+                  </pic:blipFill>
+                  <pic:spPr>
+                    <a:xfrm>
+                      <a:off x="0" y="0"/>
+                      <a:ext cx="5760720" cy="3059430"/>
+                    </a:xfrm>
+                    <a:prstGeom prst="rect">
+                      <a:avLst/>
+                    </a:prstGeom>
+                  </pic:spPr>
+                </pic:pic>
+              </a:graphicData>
+            </a:graphic>
+          </wp:inline>
+        </w:drawing>
+      </w:r>
+    </w:p>
+    <w:p>
+      <w:pPr>
+        <w:pStyle w:val="Lijstalinea"/>
+        <w:ind w:left="360"/>
+      </w:pPr>
+      <w:r>
+        <w:lastRenderedPageBreak/>
+        <w:drawing>
+          <wp:inline distT="0" distB="0" distL="0" distR="0" wp14:anchorId="35E91102" wp14:editId="21BC2631">
+            <wp:extent cx="4782217" cy="3724795"/>
+            <wp:effectExtent l="0" t="0" r="0" b="9525"/>
+            <wp:docPr id="889853845" name="Afbeelding 1" descr="Afbeelding met tekst, schermopname, Lettertype&#10;&#10;Door AI gegenereerde inhoud is mogelijk onjuist."/>
+            <wp:cNvGraphicFramePr>
+              <a:graphicFrameLocks xmlns:a="http://schemas.openxmlformats.org/drawingml/2006/main" noChangeAspect="1"/>
+            </wp:cNvGraphicFramePr>
+            <a:graphic xmlns:a="http://schemas.openxmlformats.org/drawingml/2006/main">
+              <a:graphicData uri="http://schemas.openxmlformats.org/drawingml/2006/picture">
+                <pic:pic xmlns:pic="http://schemas.openxmlformats.org/drawingml/2006/picture">
+                  <pic:nvPicPr>
+                    <pic:cNvPr id="889853845" name="Afbeelding 1" descr="Afbeelding met tekst, schermopname, Lettertype&#10;&#10;Door AI gegenereerde inhoud is mogelijk onjuist."/>
+                    <pic:cNvPicPr/>
+                  </pic:nvPicPr>
+                  <pic:blipFill>
+                    <a:blip r:embed="rId53"/>
+                    <a:stretch>
+                      <a:fillRect/>
+                    </a:stretch>
+                  </pic:blipFill>
+                  <pic:spPr>
+                    <a:xfrm>
+                      <a:off x="0" y="0"/>
+                      <a:ext cx="4782217" cy="3724795"/>
+                    </a:xfrm>
+                    <a:prstGeom prst="rect">
+                      <a:avLst/>
+                    </a:prstGeom>
+                  </pic:spPr>
+                </pic:pic>
+              </a:graphicData>
+            </a:graphic>
+          </wp:inline>
+        </w:drawing>
+      </w:r>
+    </w:p>
+    <w:p>
+      <w:pPr>
+        <w:pStyle w:val="Lijstalinea"/>
+        <w:ind w:left="360"/>
+      </w:pPr>
+      <w:r>
+        <w:lastRenderedPageBreak/>
+        <w:drawing>
+          <wp:inline distT="0" distB="0" distL="0" distR="0" wp14:anchorId="2BA05763" wp14:editId="2190A107">
+            <wp:extent cx="4858428" cy="3372321"/>
+            <wp:effectExtent l="0" t="0" r="0" b="0"/>
+            <wp:docPr id="1372816616" name="Afbeelding 1" descr="Afbeelding met tekst, schermopname, Lettertype&#10;&#10;Door AI gegenereerde inhoud is mogelijk onjuist."/>
+            <wp:cNvGraphicFramePr>
+              <a:graphicFrameLocks xmlns:a="http://schemas.openxmlformats.org/drawingml/2006/main" noChangeAspect="1"/>
+            </wp:cNvGraphicFramePr>
+            <a:graphic xmlns:a="http://schemas.openxmlformats.org/drawingml/2006/main">
+              <a:graphicData uri="http://schemas.openxmlformats.org/drawingml/2006/picture">
+                <pic:pic xmlns:pic="http://schemas.openxmlformats.org/drawingml/2006/picture">
+                  <pic:nvPicPr>
+                    <pic:cNvPr id="1372816616" name="Afbeelding 1" descr="Afbeelding met tekst, schermopname, Lettertype&#10;&#10;Door AI gegenereerde inhoud is mogelijk onjuist."/>
+                    <pic:cNvPicPr/>
+                  </pic:nvPicPr>
+                  <pic:blipFill>
+                    <a:blip r:embed="rId54"/>
+                    <a:stretch>
+                      <a:fillRect/>
+                    </a:stretch>
+                  </pic:blipFill>
+                  <pic:spPr>
+                    <a:xfrm>
+                      <a:off x="0" y="0"/>
+                      <a:ext cx="4858428" cy="3372321"/>
+                    </a:xfrm>
+                    <a:prstGeom prst="rect">
+                      <a:avLst/>
+                    </a:prstGeom>
+                  </pic:spPr>
+                </pic:pic>
+              </a:graphicData>
+            </a:graphic>
+          </wp:inline>
+        </w:drawing>
+      </w:r>
+      <w:r>
+        <w:br/>
+      </w:r>
+      <w:r>
+        <w:drawing>
+          <wp:inline distT="0" distB="0" distL="0" distR="0" wp14:anchorId="0965067A" wp14:editId="0140206A">
+            <wp:extent cx="4277322" cy="3620005"/>
+            <wp:effectExtent l="0" t="0" r="9525" b="0"/>
+            <wp:docPr id="1392625343" name="Afbeelding 1" descr="Afbeelding met tekst, schermopname, Lettertype, nummer&#10;&#10;Door AI gegenereerde inhoud is mogelijk onjuist."/>
+            <wp:cNvGraphicFramePr>
+              <a:graphicFrameLocks xmlns:a="http://schemas.openxmlformats.org/drawingml/2006/main" noChangeAspect="1"/>
+            </wp:cNvGraphicFramePr>
+            <a:graphic xmlns:a="http://schemas.openxmlformats.org/drawingml/2006/main">
+              <a:graphicData uri="http://schemas.openxmlformats.org/drawingml/2006/picture">
+                <pic:pic xmlns:pic="http://schemas.openxmlformats.org/drawingml/2006/picture">
+                  <pic:nvPicPr>
+                    <pic:cNvPr id="1392625343" name="Afbeelding 1" descr="Afbeelding met tekst, schermopname, Lettertype, nummer&#10;&#10;Door AI gegenereerde inhoud is mogelijk onjuist."/>
+                    <pic:cNvPicPr/>
+                  </pic:nvPicPr>
+                  <pic:blipFill>
+                    <a:blip r:embed="rId55"/>
+                    <a:stretch>
+                      <a:fillRect/>
+                    </a:stretch>
+                  </pic:blipFill>
+                  <pic:spPr>
+                    <a:xfrm>
+                      <a:off x="0" y="0"/>
+                      <a:ext cx="4277322" cy="3620005"/>
+                    </a:xfrm>
+                    <a:prstGeom prst="rect">
+                      <a:avLst/>
+                    </a:prstGeom>
+                  </pic:spPr>
+                </pic:pic>
+              </a:graphicData>
+            </a:graphic>
+          </wp:inline>
+        </w:drawing>
+      </w:r>
+      <w:r>
+        <w:br/>
+      </w:r>
+      <w:r>
+        <w:lastRenderedPageBreak/>
+        <w:drawing>
+          <wp:inline distT="0" distB="0" distL="0" distR="0" wp14:anchorId="37F9A275" wp14:editId="15EAC667">
+            <wp:extent cx="5744377" cy="3134162"/>
+            <wp:effectExtent l="0" t="0" r="8890" b="9525"/>
+            <wp:docPr id="1433460526" name="Afbeelding 1" descr="Afbeelding met tekst, schermopname, Lettertype&#10;&#10;Door AI gegenereerde inhoud is mogelijk onjuist."/>
+            <wp:cNvGraphicFramePr>
+              <a:graphicFrameLocks xmlns:a="http://schemas.openxmlformats.org/drawingml/2006/main" noChangeAspect="1"/>
+            </wp:cNvGraphicFramePr>
+            <a:graphic xmlns:a="http://schemas.openxmlformats.org/drawingml/2006/main">
+              <a:graphicData uri="http://schemas.openxmlformats.org/drawingml/2006/picture">
+                <pic:pic xmlns:pic="http://schemas.openxmlformats.org/drawingml/2006/picture">
+                  <pic:nvPicPr>
+                    <pic:cNvPr id="1433460526" name="Afbeelding 1" descr="Afbeelding met tekst, schermopname, Lettertype&#10;&#10;Door AI gegenereerde inhoud is mogelijk onjuist."/>
+                    <pic:cNvPicPr/>
+                  </pic:nvPicPr>
+                  <pic:blipFill>
+                    <a:blip r:embed="rId56"/>
+                    <a:stretch>
+                      <a:fillRect/>
+                    </a:stretch>
+                  </pic:blipFill>
+                  <pic:spPr>
+                    <a:xfrm>
+                      <a:off x="0" y="0"/>
+                      <a:ext cx="5744377" cy="3134162"/>
+                    </a:xfrm>
+                    <a:prstGeom prst="rect">
+                      <a:avLst/>
+                    </a:prstGeom>
+                  </pic:spPr>
+                </pic:pic>
+              </a:graphicData>
+            </a:graphic>
+          </wp:inline>
+        </w:drawing>
+      </w:r>
+      <w:r>
+        <w:br/>
+      </w:r>
+    </w:p>
+    <w:p>
+      <w:pPr>
+        <w:pStyle w:val="Lijstalinea"/>
+        <w:ind w:left="360"/>
+      </w:pPr>
+      <w:r>
+        <w:rPr>
+          <w:i/>
+          <w:iCs/>
+        </w:rPr>
+        <w:br/>
+      </w:r>
+    </w:p>
+    <w:p>
+      <w:pPr>
+        <w:pStyle w:val="Lijstalinea"/>
+        <w:numPr>
+          <w:ilvl w:val="0"/>
+          <w:numId w:val="41"/>
+        </w:numPr>
+      </w:pPr>
+      <w:r>
+        <w:rPr>
+          <w:b/>
+          <w:bCs/>
+        </w:rPr>
+        <w:t xml:space="preserve">Wat is er </w:t>
+      </w:r>
+      <w:r>
+        <w:rPr>
+          <w:b/>
+          <w:bCs/>
+        </w:rPr>
+        <w:t xml:space="preserve">in sprint </w:t>
+      </w:r>
+      <w:r>
+        <w:rPr>
+          <w:b/>
+          <w:bCs/>
+        </w:rPr>
+        <w:t>5</w:t>
+      </w:r>
+      <w:r>
+        <w:rPr>
+          <w:b/>
+          <w:bCs/>
+        </w:rPr>
+        <w:t xml:space="preserve"> bereikt? </w:t>
+      </w:r>
+    </w:p>
+    <w:p>
+      <w:pPr>
+        <w:pStyle w:val="Lijstalinea"/>
+        <w:ind w:left="360"/>
+      </w:pPr>
+      <w:r>
+        <w:t>in sprint 5 hebben we vooral bugs gefix en dingen samen gevoegd</w:t>
+      </w:r>
+      <w:r>
+        <w:br/>
+      </w:r>
+      <w:r>
+        <w:rPr>
+          <w:b/>
+          <w:bCs/>
+        </w:rPr>
+        <w:br/>
+      </w:r>
+    </w:p>
+    <w:p>
+      <w:pPr>
+        <w:pStyle w:val="Lijstalinea"/>
+        <w:numPr>
+          <w:ilvl w:val="0"/>
+          <w:numId w:val="41"/>
+        </w:numPr>
+      </w:pPr>
+      <w:r>
+        <w:rPr>
+          <w:b/>
+          <w:bCs/>
+        </w:rPr>
+        <w:t>Beschrijf mogelijke uitdagingen, obstakels en als die er zijn oplossing(en).</w:t>
+      </w:r>
+      <w:r>
+        <w:rPr>
+          <w:b/>
+          <w:bCs/>
+        </w:rPr>
+        <w:br/>
+      </w:r>
+      <w:r>
+        <w:rPr>
+          <w:i/>
+          <w:iCs/>
+        </w:rPr>
+        <w:t>dit was de laatste sprint en er koment niet meer obstakels of uitdagingen</w:t>
+      </w:r>
+      <w:r>
+        <w:rPr>
+          <w:i/>
+          <w:iCs/>
+        </w:rPr>
+        <w:br/>
+      </w:r>
+    </w:p>
+    <w:p>
+      <w:pPr>
+        <w:pStyle w:val="Lijstalinea"/>
+        <w:numPr>
+          <w:ilvl w:val="0"/>
+          <w:numId w:val="41"/>
+        </w:numPr>
+      </w:pPr>
+      <w:r>
+        <w:rPr>
+          <w:b/>
+          <w:bCs/>
+        </w:rPr>
+        <w:t>Geleerde lessen.</w:t>
+      </w:r>
+      <w:r>
+        <w:rPr>
+          <w:b/>
+          <w:bCs/>
+        </w:rPr>
+        <w:br/>
+      </w:r>
+      <w:r>
+        <w:rPr>
+          <w:i/>
+          <w:iCs/>
+        </w:rPr>
+        <w:t xml:space="preserve">ik heb geleerd </w:t>
+      </w:r>
+      <w:r>
+        <w:rPr>
+          <w:i/>
+          <w:iCs/>
+        </w:rPr>
+        <w:t>dat dingen samen voegen veel lastiger kan worder dan ik had ingezien, alles was er en het was af maar we konden het niet optijd linken met de scene en laten werken met andere scripts</w:t>
+      </w:r>
+      <w:r>
+        <w:rPr>
+          <w:i/>
+          <w:iCs/>
+        </w:rPr>
+        <w:br/>
+      </w:r>
+    </w:p>
+    <w:p>
+      <w:pPr>
+        <w:pStyle w:val="Lijstalinea"/>
+        <w:numPr>
+          <w:ilvl w:val="0"/>
+          <w:numId w:val="41"/>
+        </w:numPr>
+      </w:pPr>
+      <w:r>
+        <w:rPr>
+          <w:b/>
+          <w:bCs/>
+        </w:rPr>
+        <w:t xml:space="preserve">Vragen en onduidelijkheden. </w:t>
+      </w:r>
+      <w:r>
+        <w:rPr>
+          <w:b/>
+          <w:bCs/>
+        </w:rPr>
+        <w:br/>
+      </w:r>
+      <w:r>
+        <w:rPr>
+          <w:i/>
+          <w:iCs/>
+        </w:rPr>
+        <w:t>ik heb geen vragen of onduidelijkheden</w:t>
+      </w:r>
+      <w:r>
+        <w:rPr>
+          <w:i/>
+          <w:iCs/>
+        </w:rPr>
+        <w:br/>
+      </w:r>
+    </w:p>
+    <w:p>
+      <w:pPr>
+        <w:pStyle w:val="Lijstalinea"/>
+        <w:numPr>
+          <w:ilvl w:val="0"/>
+          <w:numId w:val="41"/>
+        </w:numPr>
+        <w:rPr>
+          <w:i/>
+          <w:iCs/>
+        </w:rPr>
+      </w:pPr>
+      <w:r>
+        <w:rPr>
+          <w:b/>
+          <w:bCs/>
+        </w:rPr>
+        <w:t>Feedback</w:t>
+      </w:r>
+      <w:r>
+        <w:t xml:space="preserve"> </w:t>
+      </w:r>
+      <w:r>
+        <w:rPr>
+          <w:b/>
+          <w:bCs/>
+        </w:rPr>
+        <w:t>en</w:t>
+      </w:r>
+      <w:r>
+        <w:t xml:space="preserve"> </w:t>
+      </w:r>
+      <w:r>
+        <w:rPr>
+          <w:b/>
+          <w:bCs/>
+        </w:rPr>
+        <w:t>waardering.</w:t>
+      </w:r>
+      <w:r>
+        <w:rPr>
+          <w:b/>
+          <w:bCs/>
+        </w:rPr>
+        <w:br/>
+      </w:r>
+      <w:r>
+        <w:rPr>
+          <w:i/>
+          <w:iCs/>
+        </w:rPr>
+        <w:t>probeer eerder met elkaar samen te werken met scripts maken en vooruit plannen hoe we het gaan linken</w:t>
+      </w:r>
+    </w:p>
+    <w:p>
+      <w:pPr>
+        <w:pStyle w:val="Lijstalinea"/>
+        <w:numPr>
+          <w:ilvl w:val="0"/>
+          <w:numId w:val="41"/>
+        </w:numPr>
+        <w:rPr>
+          <w:i/>
+          <w:iCs/>
+        </w:rPr>
+      </w:pPr>
+      <w:r>
+        <w:rPr>
+          <w:b/>
+          <w:bCs/>
+        </w:rPr>
+        <w:t xml:space="preserve">Verbeterpunten voor </w:t>
+      </w:r>
+      <w:r>
+        <w:rPr>
+          <w:b/>
+          <w:bCs/>
+        </w:rPr>
+        <w:t>volgende sprint</w:t>
+      </w:r>
+      <w:r>
+        <w:rPr>
+          <w:b/>
+          <w:bCs/>
+        </w:rPr>
+        <w:t xml:space="preserve">. </w:t>
+      </w:r>
+      <w:r>
+        <w:rPr>
+          <w:b/>
+          <w:bCs/>
+        </w:rPr>
+        <w:br/>
+      </w:r>
+      <w:r>
+        <w:rPr>
+          <w:i/>
+          <w:iCs/>
+        </w:rPr>
+        <w:t>meer communicatie kwa samen voegen van werk</w:t>
+      </w:r>
+      <w:r>
+        <w:rPr>
+          <w:i/>
+          <w:iCs/>
+        </w:rPr>
+        <w:br/>
+      </w:r>
+    </w:p>
+    <w:p>
+      <w:pPr>
+        <w:pStyle w:val="Lijstalinea"/>
+        <w:numPr>
+          <w:ilvl w:val="0"/>
+          <w:numId w:val="41"/>
+        </w:numPr>
+      </w:pPr>
+      <w:r>
+        <w:rPr>
+          <w:b/>
+          <w:bCs/>
+        </w:rPr>
+        <w:t xml:space="preserve">Persoonlijk welzijn. </w:t>
+      </w:r>
+      <w:r>
+        <w:rPr>
+          <w:b/>
+          <w:bCs/>
+        </w:rPr>
+        <w:br/>
+      </w:r>
+      <w:r>
+        <w:rPr>
+          <w:i/>
+          <w:iCs/>
+        </w:rPr>
+        <w:t>ik voel me heel goed, ben bij, in my lane, thriving</w:t>
+      </w:r>
+      <w:r>
+        <w:rPr>
+          <w:i/>
+          <w:iCs/>
+        </w:rPr>
+        <w:br/>
+      </w:r>
+    </w:p>
+    <w:p>
+      <w:pPr>
+        <w:pStyle w:val="Lijstalinea"/>
+        <w:numPr>
+          <w:ilvl w:val="0"/>
+          <w:numId w:val="41"/>
+        </w:numPr>
+        <w:rPr>
+          <w:i/>
+          <w:iCs/>
+        </w:rPr>
+      </w:pPr>
+      <w:r>
+        <w:rPr>
+          <w:b/>
+          <w:bCs/>
+        </w:rPr>
+        <w:t xml:space="preserve">Actiepunten voor de volgende sprint. </w:t>
+      </w:r>
+      <w:r>
+        <w:rPr>
+          <w:b/>
+          <w:bCs/>
+        </w:rPr>
+        <w:br/>
+      </w:r>
+      <w:r>
+        <w:t>er komt geen volgende sprint</w:t>
+      </w:r>
+    </w:p>
+    <w:p>
+      <w:pPr>
+        <w:rPr>
+          <w:i/>
+          <w:iCs/>
+        </w:rPr>
+      </w:pPr>
+    </w:p>
     <w:sectPr>
-      <w:footerReference w:type="default" r:id="rId49"/>
-      <w:headerReference w:type="first" r:id="rId50"/>
-      <w:footerReference w:type="first" r:id="rId51"/>
+      <w:footerReference w:type="default" r:id="rId57"/>
+      <w:headerReference w:type="first" r:id="rId58"/>
+      <w:footerReference w:type="first" r:id="rId59"/>
       <w:pgSz w:w="11906" w:h="16838"/>
       <w:pgMar w:top="1417" w:right="1417" w:bottom="1417" w:left="1417" w:header="708" w:footer="708" w:gutter="0"/>
       <w:cols w:space="708"/>
@@ -10489,10 +11284,6 @@
 </file>
 
 <file path=customXml/item1.xml><?xml version="1.0" encoding="utf-8"?>
-<b:Sources xmlns:b="http://schemas.openxmlformats.org/officeDocument/2006/bibliography" xmlns="http://schemas.openxmlformats.org/officeDocument/2006/bibliography" SelectedStyle="\APASixthEditionOfficeOnline.xsl" StyleName="APA" Version="6"/>
-</file>
-
-<file path=customXml/item2.xml><?xml version="1.0" encoding="utf-8"?>
 <p:properties xmlns:p="http://schemas.microsoft.com/office/2006/metadata/properties" xmlns:xsi="http://www.w3.org/2001/XMLSchema-instance" xmlns:pc="http://schemas.microsoft.com/office/infopath/2007/PartnerControls">
   <documentManagement>
     <TaxCatchAll xmlns="32dd6115-ce5d-46b4-b638-9e7d5ca6cbee" xsi:nil="true"/>
@@ -10501,6 +11292,15 @@
     </lcf76f155ced4ddcb4097134ff3c332f>
   </documentManagement>
 </p:properties>
+</file>
+
+<file path=customXml/item2.xml><?xml version="1.0" encoding="utf-8"?>
+<?mso-contentType ?>
+<FormTemplates xmlns="http://schemas.microsoft.com/sharepoint/v3/contenttype/forms">
+  <Display>DocumentLibraryForm</Display>
+  <Edit>DocumentLibraryForm</Edit>
+  <New>DocumentLibraryForm</New>
+</FormTemplates>
 </file>
 
 <file path=customXml/item3.xml><?xml version="1.0" encoding="utf-8"?>
@@ -10739,29 +11539,24 @@
 </file>
 
 <file path=customXml/item4.xml><?xml version="1.0" encoding="utf-8"?>
-<?mso-contentType ?>
-<FormTemplates xmlns="http://schemas.microsoft.com/sharepoint/v3/contenttype/forms">
-  <Display>DocumentLibraryForm</Display>
-  <Edit>DocumentLibraryForm</Edit>
-  <New>DocumentLibraryForm</New>
-</FormTemplates>
+<b:Sources xmlns:b="http://schemas.openxmlformats.org/officeDocument/2006/bibliography" xmlns="http://schemas.openxmlformats.org/officeDocument/2006/bibliography" SelectedStyle="\APASixthEditionOfficeOnline.xsl" StyleName="APA" Version="6"/>
 </file>
 
 <file path=customXml/itemProps1.xml><?xml version="1.0" encoding="utf-8"?>
-<ds:datastoreItem xmlns:ds="http://schemas.openxmlformats.org/officeDocument/2006/customXml" ds:itemID="{72B7D650-2FAA-4D72-B587-235E59E6AC26}">
-  <ds:schemaRefs>
-    <ds:schemaRef ds:uri="http://schemas.openxmlformats.org/officeDocument/2006/bibliography"/>
-  </ds:schemaRefs>
-</ds:datastoreItem>
-</file>
-
-<file path=customXml/itemProps2.xml><?xml version="1.0" encoding="utf-8"?>
 <ds:datastoreItem xmlns:ds="http://schemas.openxmlformats.org/officeDocument/2006/customXml" ds:itemID="{846B1C81-E993-40E7-BCC5-DA63F0CD945C}">
   <ds:schemaRefs>
     <ds:schemaRef ds:uri="http://schemas.microsoft.com/office/2006/metadata/properties"/>
     <ds:schemaRef ds:uri="http://schemas.microsoft.com/office/infopath/2007/PartnerControls"/>
     <ds:schemaRef ds:uri="32dd6115-ce5d-46b4-b638-9e7d5ca6cbee"/>
     <ds:schemaRef ds:uri="094ecc41-7a37-40c9-8390-f18431712098"/>
+  </ds:schemaRefs>
+</ds:datastoreItem>
+</file>
+
+<file path=customXml/itemProps2.xml><?xml version="1.0" encoding="utf-8"?>
+<ds:datastoreItem xmlns:ds="http://schemas.openxmlformats.org/officeDocument/2006/customXml" ds:itemID="{C6916C6B-E06E-47CD-A094-BBBE44C5EA8C}">
+  <ds:schemaRefs>
+    <ds:schemaRef ds:uri="http://schemas.microsoft.com/sharepoint/v3/contenttype/forms"/>
   </ds:schemaRefs>
 </ds:datastoreItem>
 </file>
@@ -10786,9 +11581,9 @@
 </file>
 
 <file path=customXml/itemProps4.xml><?xml version="1.0" encoding="utf-8"?>
-<ds:datastoreItem xmlns:ds="http://schemas.openxmlformats.org/officeDocument/2006/customXml" ds:itemID="{C6916C6B-E06E-47CD-A094-BBBE44C5EA8C}">
+<ds:datastoreItem xmlns:ds="http://schemas.openxmlformats.org/officeDocument/2006/customXml" ds:itemID="{72B7D650-2FAA-4D72-B587-235E59E6AC26}">
   <ds:schemaRefs>
-    <ds:schemaRef ds:uri="http://schemas.microsoft.com/sharepoint/v3/contenttype/forms"/>
+    <ds:schemaRef ds:uri="http://schemas.openxmlformats.org/officeDocument/2006/bibliography"/>
   </ds:schemaRefs>
 </ds:datastoreItem>
 </file>
</xml_diff>